<commit_message>
검증: Phase 1 CAPL DLL ABI 보완
생산 DLL의 21개 공개 API를 유지하면서 시험 전용 CAPL ABI Fixture를 추가했습니다.
Context 수명주기, 배열 및 F[1] 왕복, Capacity와 출력 불변성 검증을 강화했습니다.
요구사양서, 기능사양서, 개발설계서와 Traceability Matrix에 검증 결과를 반영했습니다.
</commit_message>
<xml_diff>
--- a/docs/01_Requirements/Modbus485Emulator_SRS.docx
+++ b/docs/01_Requirements/Modbus485Emulator_SRS.docx
@@ -7417,7 +7417,7 @@
                 <w:color w:val="1F2937"/>
                 <w:sz w:val="16"/>
               </w:rPr>
-              <w:t>DLL 경계에는 32bit long 상태, Scalar, 숫자 Reference 및 1차원 char[]/word[]/long[]만 사용하고 사용자 struct와 C++ 객체를 노출하지 않아야 한다.</w:t>
+              <w:t>DLL 경계에는 32bit long 상태, Scalar 및 1차원 char[]/word[]/long[]만 사용하고 Signal 물리값 출력은 저수준 ABI에서 1요소 F[]로 전달해야 하며 사용자 struct와 C++ 객체를 노출하지 않아야 한다.</w:t>
             </w:r>
           </w:p>
         </w:tc>
@@ -7967,7 +7967,7 @@
                 <w:color w:val="1F2937"/>
                 <w:sz w:val="16"/>
               </w:rPr>
-              <w:t>ReadSignal은 성공 시에만 OutPhysicalValue를 갱신하고 WriteSignal은 Index, SignalName, double 물리값을 사용해야 한다.</w:t>
+              <w:t>ReadSignal은 성공 시에만 저수준 OutPhysicalValue[0]을 갱신하고 CAPL Core는 이를 double&amp; 출력으로 감싸야 하며, WriteSignal은 Index, SignalName, double 물리값을 사용해야 한다.</w:t>
             </w:r>
           </w:p>
         </w:tc>
@@ -11033,7 +11033,7 @@
                 <w:color w:val="1F2937"/>
                 <w:sz w:val="17"/>
               </w:rPr>
-              <w:t>CANalyzer 9.x x86에서 DLL 로드, 21개 API 최소 호출, 배열/문자열/Reference/float(F) 왕복</w:t>
+              <w:t>CANalyzer 9.x x86에서 생산 DLL 로드와 21개 API 최소 호출, 시험 전용 ABI Fixture를 통한 char[]/word[]/long[]/F[1] 성공 왕복, 실패 시 caller-owned 출력 Buffer 불변성을 확인</w:t>
             </w:r>
           </w:p>
         </w:tc>
@@ -13088,7 +13088,7 @@
                 <w:color w:val="1F2937"/>
                 <w:sz w:val="14"/>
               </w:rPr>
-              <w:t>M485E_Dll_ReadSignal(ContextHandle, Index, NameLength, SignalName[], F&amp; OutPhysicalValue)</w:t>
+              <w:t>M485E_Dll_ReadSignal(ContextHandle, Index, NameLength, SignalName[], F OutPhysicalValue[1])</w:t>
             </w:r>
           </w:p>
         </w:tc>
@@ -29994,7 +29994,7 @@
                 <w:color w:val="1F2937"/>
                 <w:sz w:val="16"/>
               </w:rPr>
-              <w:t>구조 확정, 실기 검증 필요</w:t>
+              <w:t>구조 및 자동 검증 확정, CANalyzer 9.x 측정 실행 필요</w:t>
             </w:r>
           </w:p>
         </w:tc>
@@ -30019,7 +30019,7 @@
                 <w:color w:val="1F2937"/>
                 <w:sz w:val="16"/>
               </w:rPr>
-              <w:t>Phase 1 ABI Probe로 검증</w:t>
+              <w:t>생산 21 API와 시험 전용 ABI Fixture의 자동 Probe를 통과한 뒤 CANalyzer 9.x SP8에서 최종 검증</w:t>
             </w:r>
           </w:p>
         </w:tc>

</xml_diff>

<commit_message>
Broadcast 처리 및 CAPL Monitoring 동기화 반영
</commit_message>
<xml_diff>
--- a/docs/01_Requirements/Modbus485Emulator_SRS.docx
+++ b/docs/01_Requirements/Modbus485Emulator_SRS.docx
@@ -238,7 +238,11 @@
           </w:tcPr>
           <w:p>
             <w:r>
-              <w:t>0.12 / Baseline Candidate</w:t>
+              <w:rPr>
+                <w:rFonts w:ascii="Malgun Gothic" w:hAnsi="Malgun Gothic" w:eastAsia="Malgun Gothic"/>
+                <w:sz w:val="17"/>
+              </w:rPr>
+              <w:t>0.13 / Baseline Candidate</w:t>
             </w:r>
           </w:p>
         </w:tc>
@@ -725,6 +729,64 @@
           <w:p>
             <w:r>
               <w:t>RTU Stream Parser, Slave ID 0과 Register Address 0 구분 및 Port별 Monitoring Cursor 반영</w:t>
+            </w:r>
+          </w:p>
+        </w:tc>
+      </w:tr>
+      <w:tr>
+        <w:tc>
+          <w:tcPr>
+            <w:tcW w:type="dxa" w:w="1152"/>
+          </w:tcPr>
+          <w:p>
+            <w:r>
+              <w:rPr>
+                <w:rFonts w:ascii="Malgun Gothic" w:hAnsi="Malgun Gothic" w:eastAsia="Malgun Gothic"/>
+                <w:sz w:val="17"/>
+              </w:rPr>
+              <w:t>0.13</w:t>
+            </w:r>
+          </w:p>
+        </w:tc>
+        <w:tc>
+          <w:tcPr>
+            <w:tcW w:type="dxa" w:w="1584"/>
+          </w:tcPr>
+          <w:p>
+            <w:r>
+              <w:rPr>
+                <w:rFonts w:ascii="Malgun Gothic" w:hAnsi="Malgun Gothic" w:eastAsia="Malgun Gothic"/>
+                <w:sz w:val="17"/>
+              </w:rPr>
+              <w:t>2026-08-11</w:t>
+            </w:r>
+          </w:p>
+        </w:tc>
+        <w:tc>
+          <w:tcPr>
+            <w:tcW w:type="dxa" w:w="2160"/>
+          </w:tcPr>
+          <w:p>
+            <w:r>
+              <w:rPr>
+                <w:rFonts w:ascii="Malgun Gothic" w:hAnsi="Malgun Gothic" w:eastAsia="Malgun Gothic"/>
+                <w:sz w:val="17"/>
+              </w:rPr>
+              <w:t>Baseline Candidate</w:t>
+            </w:r>
+          </w:p>
+        </w:tc>
+        <w:tc>
+          <w:tcPr>
+            <w:tcW w:type="dxa" w:w="4464"/>
+          </w:tcPr>
+          <w:p>
+            <w:r>
+              <w:rPr>
+                <w:rFonts w:ascii="Malgun Gothic" w:hAnsi="Malgun Gothic" w:eastAsia="Malgun Gothic"/>
+                <w:sz w:val="17"/>
+              </w:rPr>
+              <w:t>Slave ID 0 FC10의 Port-local 무응답 원자 적용과 Broadcast Read 무적용 정책 반영</w:t>
             </w:r>
           </w:p>
         </w:tc>
@@ -2054,7 +2116,11 @@
         <w:pStyle w:val="ListBullet"/>
       </w:pPr>
       <w:r>
-        <w:t>Broadcast</w:t>
+        <w:rPr>
+          <w:rFonts w:ascii="Malgun Gothic" w:hAnsi="Malgun Gothic" w:eastAsia="Malgun Gothic"/>
+          <w:sz w:val="20"/>
+        </w:rPr>
+        <w:t>FC10 이외 Broadcast 적용</w:t>
       </w:r>
     </w:p>
     <w:p>
@@ -5815,7 +5881,7 @@
           </w:tcPr>
           <w:p>
             <w:r>
-              <w:t>Slave ID는 1~247만 구성 가능하다. Wire Slave ID 0은 Broadcast 식별자로 예약되며 V1에서는 응답과 Write 적용을 하지 않는다. 이는 0부터 허용되는 Register Address와 무관하다. Wire 248~255, 미등록 또는 다른 Slave 프레임도 무응답·무적용해야 한다.</w:t>
+              <w:t>Slave ID는 1~247만 구성 가능하다. Wire Slave ID 0의 FC10은 수신 Port의 모든 구성 Device를 전체 검증한 뒤 무응답으로 원자 적용한다. Broadcast FC03/04와 기타 Function은 무응답·무적용이다. 이는 0부터 허용되는 Register Address와 무관하다. Wire 248~255, 미등록 또는 다른 Slave 프레임도 무응답·무적용해야 한다.</w:t>
             </w:r>
           </w:p>
         </w:tc>
@@ -30442,7 +30508,7 @@
                 <w:color w:val="1F2937"/>
                 <w:sz w:val="17"/>
               </w:rPr>
-              <w:t>Modbus Master, FC06, Broadcast 및 미정의 FC</w:t>
+              <w:t>Modbus Master, FC06, FC10 이외 Broadcast 적용 및 미정의 FC</w:t>
             </w:r>
           </w:p>
         </w:tc>
@@ -30817,16 +30883,12 @@
           </w:tcBorders>
         </w:tcPr>
         <w:p>
-          <w:pPr>
-            <w:jc w:val="center"/>
-          </w:pPr>
           <w:r>
             <w:rPr>
               <w:rFonts w:ascii="Malgun Gothic" w:hAnsi="Malgun Gothic" w:eastAsia="Malgun Gothic"/>
-              <w:color w:val="64748B"/>
-              <w:sz w:val="16"/>
+              <w:sz w:val="17"/>
             </w:rPr>
-            <w:t>Version 0.12 | Baseline Candidate</w:t>
+            <w:t>Version 0.13 | Baseline Candidate</w:t>
           </w:r>
         </w:p>
       </w:tc>

</xml_diff>

<commit_message>
릴리스: Modbus485Emulator v0.5.0 구현 및 배포 준비
</commit_message>
<xml_diff>
--- a/docs/01_Requirements/Modbus485Emulator_SRS.docx
+++ b/docs/01_Requirements/Modbus485Emulator_SRS.docx
@@ -32,7 +32,7 @@
           <w:color w:val="64748B"/>
           <w:sz w:val="26"/>
         </w:rPr>
-        <w:t>Modbus485Emulator - Release 0.4.0 공식 요구사항 Baseline</w:t>
+        <w:t>Modbus485Emulator - Release 0.5.0 공식 요구사항 Baseline</w:t>
       </w:r>
     </w:p>
     <w:tbl>
@@ -238,7 +238,7 @@
           </w:tcPr>
           <w:p>
             <w:r>
-              <w:t>0.16 / Release 0.4.0 Baseline</w:t>
+              <w:t>0.17 / Release 0.5.0 Baseline</w:t>
             </w:r>
           </w:p>
         </w:tc>
@@ -284,7 +284,7 @@
           </w:tcPr>
           <w:p>
             <w:r>
-              <w:t>2026-08-13</w:t>
+              <w:t>2026-08-17</w:t>
             </w:r>
           </w:p>
         </w:tc>
@@ -306,7 +306,7 @@
           <w:color w:val="2E75B6"/>
           <w:sz w:val="20"/>
         </w:rPr>
-        <w:t>문서 상태: Release 0.4.0 요구사항 Baseline</w:t>
+        <w:t>문서 상태: Release 0.5.0 요구사항 Baseline</w:t>
       </w:r>
     </w:p>
     <w:p>
@@ -923,6 +923,48 @@
           <w:p>
             <w:r>
               <w:t>0x80 Periodic-only Monitoring, 23개 ABI 및 Rule Data Metadata V1(9개 필드) 계약 반영</w:t>
+            </w:r>
+          </w:p>
+        </w:tc>
+      </w:tr>
+      <w:tr>
+        <w:tc>
+          <w:tcPr>
+            <w:tcW w:type="dxa" w:w="1152"/>
+          </w:tcPr>
+          <w:p>
+            <w:r>
+              <w:t>0.17</w:t>
+            </w:r>
+          </w:p>
+        </w:tc>
+        <w:tc>
+          <w:tcPr>
+            <w:tcW w:type="dxa" w:w="1584"/>
+          </w:tcPr>
+          <w:p>
+            <w:r>
+              <w:t>2026-08-17</w:t>
+            </w:r>
+          </w:p>
+        </w:tc>
+        <w:tc>
+          <w:tcPr>
+            <w:tcW w:type="dxa" w:w="2160"/>
+          </w:tcPr>
+          <w:p>
+            <w:r>
+              <w:t>Release Baseline</w:t>
+            </w:r>
+          </w:p>
+        </w:tc>
+        <w:tc>
+          <w:tcPr>
+            <w:tcW w:type="dxa" w:w="4464"/>
+          </w:tcPr>
+          <w:p>
+            <w:r>
+              <w:t>Btn_ReadOption Scalar 편의 변수와 RTU CSV 동일 문자열의 CAPL Output View 최근 10줄 표시 계약 반영</w:t>
             </w:r>
           </w:p>
         </w:tc>
@@ -2769,7 +2811,7 @@
         <w:pStyle w:val="ListBullet"/>
       </w:pPr>
       <w:r>
-        <w:t>v0.4.0은 Windows x86/x64를 함께 공식 배포하며 CANalyzer 18 x64 Measurement는 외부 검증 대상이다.</w:t>
+        <w:t>v0.5.0은 Windows x86/x64를 함께 공식 배포하며 CANalyzer 18 x64 Measurement는 외부 검증 대상이다.</w:t>
       </w:r>
     </w:p>
     <w:p>
@@ -2809,7 +2851,7 @@
         <w:pStyle w:val="ListBullet"/>
       </w:pPr>
       <w:r>
-        <w:t>Release 0.4.0 공개 계약은 M485E_ Prefix의 23개 CAPL DLL API와 FC03·FC04·FC10 동작만 포함한다.</w:t>
+        <w:t>Release 0.5.0 공개 계약은 M485E_ Prefix의 23개 CAPL DLL API와 FC03·FC04·FC10 동작만 포함한다.</w:t>
       </w:r>
     </w:p>
     <w:p>
@@ -4608,7 +4650,7 @@
                 <w:color w:val="1F2937"/>
                 <w:sz w:val="16"/>
               </w:rPr>
-              <w:t>ReadOption은 최대 200개 Rule의 0x80 Periodic 선택만 제어하고 여러 변경을 다음 1,000ms Cycle 경계에 원자 적용해야 한다.</w:t>
+              <w:t>ReadOption은 최대 200개 Rule의 0x80 Periodic 선택만 제어하고 여러 변경을 다음 1,000ms Cycle 경계에 원자 적용해야 한다. Monitoring::Btn_ReadOption은 int32 Scalar 편의 버튼으로만 제공하며 별도 CAPL Handler를 만들지 않고 Check_ReadOption[200], 100ms Candidate 동기화와 1,000ms 적용 정책을 변경하지 않아야 한다.</w:t>
             </w:r>
           </w:p>
         </w:tc>
@@ -5511,7 +5553,7 @@
                 <w:rFonts w:ascii="Aptos" w:hAnsi="Aptos"/>
                 <w:sz w:val="18"/>
               </w:rPr>
-              <w:t>RTU Log Switch가 ON이면 Master 요청과 실제 응답 또는 무응답 결과를 동일 Sequence의 REQ/RES 또는 REQ/NO_RES CSV 행으로 기록해야 한다.</w:t>
+              <w:t>RTU Log Switch가 ON이면 Master 요청과 실제 응답 또는 무응답 결과를 동일 Sequence의 REQ/RES 또는 REQ/NO_RES CSV 행으로 빠짐없이 기록해야 한다. 동일한 Dequeue 문자열은 별도 Queue Consumer 없이 CAPL Output View의 최근 10줄 표시에도 재사용해야 한다.</w:t>
             </w:r>
           </w:p>
         </w:tc>
@@ -5554,7 +5596,7 @@
           </w:tcPr>
           <w:p>
             <w:r>
-              <w:t>RTU Log OFF→ON마다 M485E_RTU_YYYYMMDD_HHMMSS.csv를 새로 생성하고 이름 충돌 시 순번 접미사를 사용해야 한다. 파일 Open 성공 후에만 DLL Capture를 시작하며 OFF와 Measurement 종료 시 처리 중 Transaction을 최대 2초 기다리고 완료 행을 배출한 뒤 닫아야 한다. CAPL만 파일 I/O를 수행해야 한다.</w:t>
+              <w:t>RTU Log OFF→ON마다 M485E_RTU_YYYYMMDD_HHMMSS.csv를 새로 생성하고 이름 충돌 시 순번 접미사를 사용해야 한다. 파일 Open 성공 후에만 DLL Capture를 시작하며 OFF와 Measurement 종료 시 처리 중 Transaction을 최대 2초 기다리고 완료 행을 배출한 뒤 닫아야 한다. CAPL만 파일 I/O를 수행해야 한다. Panel 이름과 CAPL Output View Control 이름은 단일 설정 영역에서 변경 가능해야 하며, 최근 10줄을 최대 200ms에 한 번 Overwrite하고 Panel 표시 실패가 CSV 기록을 실패시키지 않아야 한다. Log OFF 후 마지막 Panel 내용은 유지해야 한다.</w:t>
             </w:r>
           </w:p>
         </w:tc>
@@ -8578,7 +8620,7 @@
                 <w:rFonts w:ascii="Aptos" w:hAnsi="Aptos"/>
                 <w:sz w:val="18"/>
               </w:rPr>
-              <w:t>CAPL DLL Export Table은 Appendix A의 v0.4.0 23개 Entry를 정확히 제공하고 StartMonitoring, StopMonitoring, TryDequeueChangeSnapshot 및 GetChangeQueueStats를 공개하지 않아야 한다.</w:t>
+              <w:t>CAPL DLL Export Table은 Appendix A의 v0.5.0 23개 Entry를 정확히 제공하고 StartMonitoring, StopMonitoring, TryDequeueChangeSnapshot 및 GetChangeQueueStats를 공개하지 않아야 한다.</w:t>
             </w:r>
           </w:p>
         </w:tc>
@@ -10883,7 +10925,7 @@
                 <w:color w:val="1F2937"/>
                 <w:sz w:val="16"/>
               </w:rPr>
-              <w:t>공식 v0.4.0 빌드·검증·배포 대상은 CANalyzer 9.x SP8 Windows x86과 CANalyzer 18 Windows x64이다.</w:t>
+              <w:t>공식 v0.5.0 빌드·검증·배포 대상은 CANalyzer 9.x SP8 Windows x86과 CANalyzer 18 Windows x64이다.</w:t>
             </w:r>
           </w:p>
         </w:tc>
@@ -10993,7 +11035,7 @@
                 <w:color w:val="1F2937"/>
                 <w:sz w:val="16"/>
               </w:rPr>
-              <w:t>Release 0.4.0은 M485E_ Prefix의 23개 공개 API, Windows x86/x64 Build, FC03·FC04·FC10 및 정식 문서 집합을 단일 호환 기준으로 유지해야 한다.</w:t>
+              <w:t>Release 0.5.0은 M485E_ Prefix의 23개 공개 API, Windows x86/x64 Build, FC03·FC04·FC10 및 정식 문서 집합을 단일 호환 기준으로 유지해야 한다.</w:t>
             </w:r>
           </w:p>
         </w:tc>
@@ -12260,7 +12302,7 @@
                 <w:rFonts w:ascii="Aptos" w:hAnsi="Aptos"/>
                 <w:sz w:val="18"/>
               </w:rPr>
-              <w:t>Index 비활성 무응답·무변경과 peer 격리, Device 상태 LED, REQ/RES·NO_RES pairing, 새 파일·용량·손실 진단</w:t>
+              <w:t>Index 비활성 무응답·무변경과 peer 격리, Device 상태 LED, REQ/RES·NO_RES pairing, 새 파일·용량·손실 진단, Btn_ReadOption int32 Scalar/no-handler 및 동일 Drain 문자열의 최근 10줄·200ms CAPL Output View 표시</w:t>
             </w:r>
           </w:p>
         </w:tc>
@@ -18452,7 +18494,7 @@
     </w:p>
     <w:p>
       <w:r>
-        <w:t>아래 91개 코드는 v0.4.0 공개 계약이다. 신규 코드는 각 기능 영역의 미사용 번호에 추가할 수 있으나 기존 숫자·상수명·의미·Message Key는 변경하거나 재사용하지 않는다.</w:t>
+        <w:t>아래 91개 코드는 v0.5.0 공개 계약이다. 신규 코드는 각 기능 영역의 미사용 번호에 추가할 수 있으나 기존 숫자·상수명·의미·Message Key는 변경하거나 재사용하지 않는다.</w:t>
       </w:r>
     </w:p>
     <w:p>
@@ -31285,7 +31327,7 @@
                 <w:color w:val="1F2937"/>
                 <w:sz w:val="17"/>
               </w:rPr>
-              <w:t>x64 v0.4.0 실환경 검증</w:t>
+              <w:t>x64 v0.5.0 실환경 검증</w:t>
             </w:r>
           </w:p>
         </w:tc>

</xml_diff>

<commit_message>
릴리스: Modbus485Emulator v0.6.0 Panel Generator 구현 및 배포 준비
</commit_message>
<xml_diff>
--- a/docs/01_Requirements/Modbus485Emulator_SRS.docx
+++ b/docs/01_Requirements/Modbus485Emulator_SRS.docx
@@ -32,7 +32,7 @@
           <w:color w:val="64748B"/>
           <w:sz w:val="26"/>
         </w:rPr>
-        <w:t>Modbus485Emulator - Release 0.5.0 공식 요구사항 Baseline</w:t>
+        <w:t>Modbus485Emulator - Release 0.6.0 공식 요구사항 Baseline</w:t>
       </w:r>
     </w:p>
     <w:tbl>
@@ -238,7 +238,7 @@
           </w:tcPr>
           <w:p>
             <w:r>
-              <w:t>0.17 / Release 0.5.0 Baseline</w:t>
+              <w:t>0.18 / Release 0.6.0 Baseline</w:t>
             </w:r>
           </w:p>
         </w:tc>
@@ -284,7 +284,7 @@
           </w:tcPr>
           <w:p>
             <w:r>
-              <w:t>2026-08-17</w:t>
+              <w:t>2026-08-20</w:t>
             </w:r>
           </w:p>
         </w:tc>
@@ -306,7 +306,7 @@
           <w:color w:val="2E75B6"/>
           <w:sz w:val="20"/>
         </w:rPr>
-        <w:t>문서 상태: Release 0.5.0 요구사항 Baseline</w:t>
+        <w:t>문서 상태: Release 0.6.0 요구사항 Baseline</w:t>
       </w:r>
     </w:p>
     <w:p>
@@ -965,6 +965,68 @@
           <w:p>
             <w:r>
               <w:t>Btn_ReadOption Scalar 편의 변수와 RTU CSV 동일 문자열의 CAPL Output View 최근 10줄 표시 계약 반영</w:t>
+            </w:r>
+          </w:p>
+        </w:tc>
+      </w:tr>
+      <w:tr>
+        <w:tc>
+          <w:tcPr>
+            <w:tcW w:type="dxa" w:w="1152"/>
+          </w:tcPr>
+          <w:p>
+            <w:r/>
+            <w:r>
+              <w:rPr>
+                <w:b w:val="0"/>
+                <w:sz w:val="18"/>
+              </w:rPr>
+              <w:t>0.18</w:t>
+            </w:r>
+          </w:p>
+        </w:tc>
+        <w:tc>
+          <w:tcPr>
+            <w:tcW w:type="dxa" w:w="1584"/>
+          </w:tcPr>
+          <w:p>
+            <w:r/>
+            <w:r>
+              <w:rPr>
+                <w:b w:val="0"/>
+                <w:sz w:val="18"/>
+              </w:rPr>
+              <w:t>2026-08-20</w:t>
+            </w:r>
+          </w:p>
+        </w:tc>
+        <w:tc>
+          <w:tcPr>
+            <w:tcW w:type="dxa" w:w="2160"/>
+          </w:tcPr>
+          <w:p>
+            <w:r/>
+            <w:r>
+              <w:rPr>
+                <w:b w:val="0"/>
+                <w:sz w:val="18"/>
+              </w:rPr>
+              <w:t>Release Baseline</w:t>
+            </w:r>
+          </w:p>
+        </w:tc>
+        <w:tc>
+          <w:tcPr>
+            <w:tcW w:type="dxa" w:w="4464"/>
+          </w:tcPr>
+          <w:p>
+            <w:r/>
+            <w:r>
+              <w:rPr>
+                <w:b w:val="0"/>
+                <w:sz w:val="18"/>
+              </w:rPr>
+              <w:t>CANalyzer 9.x Device Signal Panel Generator, XVP/vsysvar/CAPL, Raw Hex, bounded Panel 동작과 안전한 생성·배포 계약 반영</w:t>
             </w:r>
           </w:p>
         </w:tc>
@@ -2811,7 +2873,7 @@
         <w:pStyle w:val="ListBullet"/>
       </w:pPr>
       <w:r>
-        <w:t>v0.5.0은 Windows x86/x64를 함께 공식 배포하며 CANalyzer 18 x64 Measurement는 외부 검증 대상이다.</w:t>
+        <w:t>v0.6.0은 Windows x86/x64를 함께 공식 배포하며 CANalyzer 18 x64 Measurement는 외부 검증 대상이다.</w:t>
       </w:r>
     </w:p>
     <w:p>
@@ -2851,7 +2913,7 @@
         <w:pStyle w:val="ListBullet"/>
       </w:pPr>
       <w:r>
-        <w:t>Release 0.5.0 공개 계약은 M485E_ Prefix의 23개 CAPL DLL API와 FC03·FC04·FC10 동작만 포함한다.</w:t>
+        <w:t>Release 0.6.0 공개 계약은 M485E_ Prefix의 23개 CAPL DLL API와 FC03·FC04·FC10 동작만 포함한다.</w:t>
       </w:r>
     </w:p>
     <w:p>
@@ -8620,7 +8682,7 @@
                 <w:rFonts w:ascii="Aptos" w:hAnsi="Aptos"/>
                 <w:sz w:val="18"/>
               </w:rPr>
-              <w:t>CAPL DLL Export Table은 Appendix A의 v0.5.0 23개 Entry를 정확히 제공하고 StartMonitoring, StopMonitoring, TryDequeueChangeSnapshot 및 GetChangeQueueStats를 공개하지 않아야 한다.</w:t>
+              <w:t>CAPL DLL Export Table은 Appendix A의 v0.6.0 23개 Entry를 정확히 제공하고 StartMonitoring, StopMonitoring, TryDequeueChangeSnapshot 및 GetChangeQueueStats를 공개하지 않아야 한다.</w:t>
             </w:r>
           </w:p>
         </w:tc>
@@ -10925,7 +10987,7 @@
                 <w:color w:val="1F2937"/>
                 <w:sz w:val="16"/>
               </w:rPr>
-              <w:t>공식 v0.5.0 빌드·검증·배포 대상은 CANalyzer 9.x SP8 Windows x86과 CANalyzer 18 Windows x64이다.</w:t>
+              <w:t>공식 v0.6.0 빌드·검증·배포 대상은 CANalyzer 9.x SP8 Windows x86과 CANalyzer 18 Windows x64이다.</w:t>
             </w:r>
           </w:p>
         </w:tc>
@@ -11035,7 +11097,7 @@
                 <w:color w:val="1F2937"/>
                 <w:sz w:val="16"/>
               </w:rPr>
-              <w:t>Release 0.5.0은 M485E_ Prefix의 23개 공개 API, Windows x86/x64 Build, FC03·FC04·FC10 및 정식 문서 집합을 단일 호환 기준으로 유지해야 한다.</w:t>
+              <w:t>Release 0.6.0은 M485E_ Prefix의 23개 공개 API, Windows x86/x64 Build, FC03·FC04·FC10 및 정식 문서 집합을 단일 호환 기준으로 유지해야 한다.</w:t>
             </w:r>
           </w:p>
         </w:tc>
@@ -18494,7 +18556,7 @@
     </w:p>
     <w:p>
       <w:r>
-        <w:t>아래 91개 코드는 v0.5.0 공개 계약이다. 신규 코드는 각 기능 영역의 미사용 번호에 추가할 수 있으나 기존 숫자·상수명·의미·Message Key는 변경하거나 재사용하지 않는다.</w:t>
+        <w:t>아래 91개 코드는 v0.6.0 공개 계약이다. 신규 코드는 각 기능 영역의 미사용 번호에 추가할 수 있으나 기존 숫자·상수명·의미·Message Key는 변경하거나 재사용하지 않는다.</w:t>
       </w:r>
     </w:p>
     <w:p>
@@ -31327,7 +31389,7 @@
                 <w:color w:val="1F2937"/>
                 <w:sz w:val="17"/>
               </w:rPr>
-              <w:t>x64 v0.5.0 실환경 검증</w:t>
+              <w:t>x64 v0.6.0 실환경 검증</w:t>
             </w:r>
           </w:p>
         </w:tc>
@@ -31542,6 +31604,724 @@
                 <w:sz w:val="18"/>
               </w:rPr>
               <w:t>완결 Transaction 256개를 초과하면 oldest-drop하고 DroppedCount를 누적하되 이미 배출한 REQ의 짝은 보존한다.</w:t>
+            </w:r>
+          </w:p>
+        </w:tc>
+      </w:tr>
+    </w:tbl>
+    <w:p>
+      <w:pPr>
+        <w:pStyle w:val="Heading1"/>
+        <w:pageBreakBefore/>
+      </w:pPr>
+      <w:r>
+        <w:t>Appendix F. Device Signal Panel Generator Contract</w:t>
+      </w:r>
+    </w:p>
+    <w:p>
+      <w:r>
+        <w:t>Release 0.6.0은 공개 DLL API 23개를 변경하지 않고 Python Generator와 generated CAPL/System Variable 계층을 추가한다. 회사 Register Map은 외부 입력이며 저장소에는 Sample과 합성 Fixture만 포함한다.</w:t>
+      </w:r>
+    </w:p>
+    <w:p>
+      <w:pPr>
+        <w:pStyle w:val="Caption"/>
+      </w:pPr>
+      <w:r>
+        <w:t>Table 29. Device Signal Panel Generator 요구사항</w:t>
+      </w:r>
+    </w:p>
+    <w:tbl>
+      <w:tblPr>
+        <w:tblStyle w:val="TableGrid"/>
+        <w:tblW w:type="auto" w:w="0"/>
+        <w:tblLayout w:type="autofit"/>
+        <w:tblLook w:firstColumn="1" w:firstRow="1" w:lastColumn="0" w:lastRow="0" w:noHBand="0" w:noVBand="1" w:val="04A0"/>
+      </w:tblPr>
+      <w:tblGrid>
+        <w:gridCol w:w="4680"/>
+        <w:gridCol w:w="4680"/>
+      </w:tblGrid>
+      <w:tr>
+        <w:tc>
+          <w:tcPr>
+            <w:tcW w:type="dxa" w:w="4680"/>
+            <w:shd w:fill="2F75B5"/>
+          </w:tcPr>
+          <w:p>
+            <w:r>
+              <w:rPr>
+                <w:color w:val="FFFFFF"/>
+              </w:rPr>
+            </w:r>
+            <w:r>
+              <w:rPr>
+                <w:b/>
+                <w:color w:val="FFFFFF"/>
+                <w:sz w:val="18"/>
+              </w:rPr>
+              <w:t>Requirement ID</w:t>
+            </w:r>
+          </w:p>
+        </w:tc>
+        <w:tc>
+          <w:tcPr>
+            <w:tcW w:type="dxa" w:w="4680"/>
+            <w:shd w:fill="2F75B5"/>
+          </w:tcPr>
+          <w:p>
+            <w:r>
+              <w:rPr>
+                <w:color w:val="FFFFFF"/>
+              </w:rPr>
+            </w:r>
+            <w:r>
+              <w:rPr>
+                <w:b/>
+                <w:color w:val="FFFFFF"/>
+                <w:sz w:val="18"/>
+              </w:rPr>
+              <w:t>Requirement</w:t>
+            </w:r>
+          </w:p>
+        </w:tc>
+      </w:tr>
+      <w:tr>
+        <w:tc>
+          <w:tcPr>
+            <w:tcW w:type="dxa" w:w="4680"/>
+          </w:tcPr>
+          <w:p>
+            <w:r/>
+            <w:r>
+              <w:rPr>
+                <w:b w:val="0"/>
+                <w:sz w:val="18"/>
+              </w:rPr>
+              <w:t>FR-DPG-001</w:t>
+            </w:r>
+          </w:p>
+        </w:tc>
+        <w:tc>
+          <w:tcPr>
+            <w:tcW w:type="dxa" w:w="4680"/>
+          </w:tcPr>
+          <w:p>
+            <w:r/>
+            <w:r>
+              <w:rPr>
+                <w:b w:val="0"/>
+                <w:sz w:val="18"/>
+              </w:rPr>
+              <w:t>Device CSV Header(Index,Port,Slave_ID,Device_Name,CSV_DB_Name)와 Register Map Header 14개를 이름·순서까지 정확히 검사한다.</w:t>
+            </w:r>
+          </w:p>
+        </w:tc>
+      </w:tr>
+      <w:tr>
+        <w:tc>
+          <w:tcPr>
+            <w:tcW w:type="dxa" w:w="4680"/>
+          </w:tcPr>
+          <w:p>
+            <w:r/>
+            <w:r>
+              <w:rPr>
+                <w:b w:val="0"/>
+                <w:sz w:val="18"/>
+              </w:rPr>
+              <w:t>FR-DPG-002</w:t>
+            </w:r>
+          </w:p>
+        </w:tc>
+        <w:tc>
+          <w:tcPr>
+            <w:tcW w:type="dxa" w:w="4680"/>
+          </w:tcPr>
+          <w:p>
+            <w:r/>
+            <w:r>
+              <w:rPr>
+                <w:b w:val="0"/>
+                <w:sz w:val="18"/>
+              </w:rPr>
+              <w:t>CSV_DB_Name은 Device CSV 디렉터리 기준 상대경로만 허용하고 절대경로, .. 이탈, 누락 파일, 중복 Device Index/SignalName 및 잘못된 Signal 필드를 거부한다.</w:t>
+            </w:r>
+          </w:p>
+        </w:tc>
+      </w:tr>
+      <w:tr>
+        <w:tc>
+          <w:tcPr>
+            <w:tcW w:type="dxa" w:w="4680"/>
+          </w:tcPr>
+          <w:p>
+            <w:r/>
+            <w:r>
+              <w:rPr>
+                <w:b w:val="0"/>
+                <w:sz w:val="18"/>
+              </w:rPr>
+              <w:t>FR-DPG-003</w:t>
+            </w:r>
+          </w:p>
+        </w:tc>
+        <w:tc>
+          <w:tcPr>
+            <w:tcW w:type="dxa" w:w="4680"/>
+          </w:tcPr>
+          <w:p>
+            <w:r/>
+            <w:r>
+              <w:rPr>
+                <w:b w:val="0"/>
+                <w:sz w:val="18"/>
+              </w:rPr>
+              <w:t>GUI Analyze와 CLI는 동일 Parser/Generator Core를 사용하고 오류에 파일·행·Column·원인을 제공한다.</w:t>
+            </w:r>
+          </w:p>
+        </w:tc>
+      </w:tr>
+      <w:tr>
+        <w:tc>
+          <w:tcPr>
+            <w:tcW w:type="dxa" w:w="4680"/>
+          </w:tcPr>
+          <w:p>
+            <w:r/>
+            <w:r>
+              <w:rPr>
+                <w:b w:val="0"/>
+                <w:sz w:val="18"/>
+              </w:rPr>
+              <w:t>FR-DPG-004</w:t>
+            </w:r>
+          </w:p>
+        </w:tc>
+        <w:tc>
+          <w:tcPr>
+            <w:tcW w:type="dxa" w:w="4680"/>
+          </w:tcPr>
+          <w:p>
+            <w:r/>
+            <w:r>
+              <w:rPr>
+                <w:b w:val="0"/>
+                <w:sz w:val="18"/>
+              </w:rPr>
+              <w:t>출력은 실행 파일 위치의 Output에 임시 생성·검증 후 Manifest 소유 기존 Output만 교체하며 실패 시 기존 Output을 보존한다.</w:t>
+            </w:r>
+          </w:p>
+        </w:tc>
+      </w:tr>
+      <w:tr>
+        <w:tc>
+          <w:tcPr>
+            <w:tcW w:type="dxa" w:w="4680"/>
+          </w:tcPr>
+          <w:p>
+            <w:r/>
+            <w:r>
+              <w:rPr>
+                <w:b w:val="0"/>
+                <w:sz w:val="18"/>
+              </w:rPr>
+              <w:t>FR-DPG-005</w:t>
+            </w:r>
+          </w:p>
+        </w:tc>
+        <w:tc>
+          <w:tcPr>
+            <w:tcW w:type="dxa" w:w="4680"/>
+          </w:tcPr>
+          <w:p>
+            <w:r/>
+            <w:r>
+              <w:rPr>
+                <w:b w:val="0"/>
+                <w:sz w:val="18"/>
+              </w:rPr>
+              <w:t>동일 입력은 timestamp 없는 byte-identical 산출물을 만들고 Manifest에 Generator Version, 입력 SHA256, Device/Signal Mapping, 출력 SHA256을 기록한다.</w:t>
+            </w:r>
+          </w:p>
+        </w:tc>
+      </w:tr>
+      <w:tr>
+        <w:tc>
+          <w:tcPr>
+            <w:tcW w:type="dxa" w:w="4680"/>
+          </w:tcPr>
+          <w:p>
+            <w:r/>
+            <w:r>
+              <w:rPr>
+                <w:b w:val="0"/>
+                <w:sz w:val="18"/>
+              </w:rPr>
+              <w:t>FR-DPG-006</w:t>
+            </w:r>
+          </w:p>
+        </w:tc>
+        <w:tc>
+          <w:tcPr>
+            <w:tcW w:type="dxa" w:w="4680"/>
+          </w:tcPr>
+          <w:p>
+            <w:r/>
+            <w:r>
+              <w:rPr>
+                <w:b w:val="0"/>
+                <w:sz w:val="18"/>
+              </w:rPr>
+              <w:t>실제 sparse Device Index별 폴더와 독립 XVP, CAPL baseline, System Variable을 생성하며 공유 Register Map도 Device 상태를 공유하지 않는다.</w:t>
+            </w:r>
+          </w:p>
+        </w:tc>
+      </w:tr>
+      <w:tr>
+        <w:tc>
+          <w:tcPr>
+            <w:tcW w:type="dxa" w:w="4680"/>
+          </w:tcPr>
+          <w:p>
+            <w:r/>
+            <w:r>
+              <w:rPr>
+                <w:b w:val="0"/>
+                <w:sz w:val="18"/>
+              </w:rPr>
+              <w:t>FR-DPG-007</w:t>
+            </w:r>
+          </w:p>
+        </w:tc>
+        <w:tc>
+          <w:tcPr>
+            <w:tcW w:type="dxa" w:w="4680"/>
+          </w:tcPr>
+          <w:p>
+            <w:r/>
+            <w:r>
+              <w:rPr>
+                <w:b w:val="0"/>
+                <w:sz w:val="18"/>
+              </w:rPr>
+              <w:t>XVP는 실제 Decimal 최소 Address 기준 31 Register inclusive Group을 만들고 빈 Group을 생략하며 시작 Address로 Signal을 배치한다.</w:t>
+            </w:r>
+          </w:p>
+        </w:tc>
+      </w:tr>
+      <w:tr>
+        <w:tc>
+          <w:tcPr>
+            <w:tcW w:type="dxa" w:w="4680"/>
+          </w:tcPr>
+          <w:p>
+            <w:r/>
+            <w:r>
+              <w:rPr>
+                <w:b w:val="0"/>
+                <w:sz w:val="18"/>
+              </w:rPr>
+              <w:t>FR-DPG-008</w:t>
+            </w:r>
+          </w:p>
+        </w:tc>
+        <w:tc>
+          <w:tcPr>
+            <w:tcW w:type="dxa" w:w="4680"/>
+          </w:tcPr>
+          <w:p>
+            <w:r/>
+            <w:r>
+              <w:rPr>
+                <w:b w:val="0"/>
+                <w:sz w:val="18"/>
+              </w:rPr>
+              <w:t>한 Group은 MAX_ROWS_PER_FRAGMENT=15로 P01/P02 분할하고 GroupBox 제목은 동일 Address 범위를 유지한다.</w:t>
+            </w:r>
+          </w:p>
+        </w:tc>
+      </w:tr>
+      <w:tr>
+        <w:tc>
+          <w:tcPr>
+            <w:tcW w:type="dxa" w:w="4680"/>
+          </w:tcPr>
+          <w:p>
+            <w:r/>
+            <w:r>
+              <w:rPr>
+                <w:b w:val="0"/>
+                <w:sz w:val="18"/>
+              </w:rPr>
+              <w:t>FR-DPG-009</w:t>
+            </w:r>
+          </w:p>
+        </w:tc>
+        <w:tc>
+          <w:tcPr>
+            <w:tcW w:type="dxa" w:w="4680"/>
+          </w:tcPr>
+          <w:p>
+            <w:r/>
+            <w:r>
+              <w:rPr>
+                <w:b w:val="0"/>
+                <w:sz w:val="18"/>
+              </w:rPr>
+              <w:t>XVP는 Static Signal/Init, read-only RawHex string, editable PhysicalValue float64 array 및 Device/Common Command·Result binding을 각각 정확히 한 번 제공한다.</w:t>
+            </w:r>
+          </w:p>
+        </w:tc>
+      </w:tr>
+      <w:tr>
+        <w:tc>
+          <w:tcPr>
+            <w:tcW w:type="dxa" w:w="4680"/>
+          </w:tcPr>
+          <w:p>
+            <w:r/>
+            <w:r>
+              <w:rPr>
+                <w:b w:val="0"/>
+                <w:sz w:val="18"/>
+              </w:rPr>
+              <w:t>FR-DPG-010</w:t>
+            </w:r>
+          </w:p>
+        </w:tc>
+        <w:tc>
+          <w:tcPr>
+            <w:tcW w:type="dxa" w:w="4680"/>
+          </w:tcPr>
+          <w:p>
+            <w:r/>
+            <w:r>
+              <w:rPr>
+                <w:b w:val="0"/>
+                <w:sz w:val="18"/>
+              </w:rPr>
+              <w:t>M485E_DevicePanel Common과 실제 Index별 PhysicalValue, RawHex, command, SnapshotValid, Result/Written/Failed System Variable 계약을 생성한다.</w:t>
+            </w:r>
+          </w:p>
+        </w:tc>
+      </w:tr>
+      <w:tr>
+        <w:tc>
+          <w:tcPr>
+            <w:tcW w:type="dxa" w:w="4680"/>
+          </w:tcPr>
+          <w:p>
+            <w:r/>
+            <w:r>
+              <w:rPr>
+                <w:b w:val="0"/>
+                <w:sz w:val="18"/>
+              </w:rPr>
+              <w:t>FR-DPG-011</w:t>
+            </w:r>
+          </w:p>
+        </w:tc>
+        <w:tc>
+          <w:tcPr>
+            <w:tcW w:type="dxa" w:w="4680"/>
+          </w:tcPr>
+          <w:p>
+            <w:r/>
+            <w:r>
+              <w:rPr>
+                <w:b w:val="0"/>
+                <w:sz w:val="18"/>
+              </w:rPr>
+              <w:t>Raw Hex는 논리 Signal Frame에 Start_Bit/Size를 적용한 1~64bit unsigned pattern을 0x prefix, 대문자, ceil(Size/4) leading-zero 형식으로 표시한다.</w:t>
+            </w:r>
+          </w:p>
+        </w:tc>
+      </w:tr>
+      <w:tr>
+        <w:tc>
+          <w:tcPr>
+            <w:tcW w:type="dxa" w:w="4680"/>
+          </w:tcPr>
+          <w:p>
+            <w:r/>
+            <w:r>
+              <w:rPr>
+                <w:b w:val="0"/>
+                <w:sz w:val="18"/>
+              </w:rPr>
+              <w:t>FR-DPG-012</w:t>
+            </w:r>
+          </w:p>
+        </w:tc>
+        <w:tc>
+          <w:tcPr>
+            <w:tcW w:type="dxa" w:w="4680"/>
+          </w:tcPr>
+          <w:p>
+            <w:r/>
+            <w:r>
+              <w:rPr>
+                <w:b w:val="0"/>
+                <w:sz w:val="18"/>
+              </w:rPr>
+              <w:t>HighWordFirst와 Word 내부 LittleEndian swap을 적용하고 같은 Address+Length+Byte_Order Frame의 bit Signal은 한 Register Read를 재사용한다.</w:t>
+            </w:r>
+          </w:p>
+        </w:tc>
+      </w:tr>
+      <w:tr>
+        <w:tc>
+          <w:tcPr>
+            <w:tcW w:type="dxa" w:w="4680"/>
+          </w:tcPr>
+          <w:p>
+            <w:r/>
+            <w:r>
+              <w:rPr>
+                <w:b w:val="0"/>
+                <w:sz w:val="18"/>
+              </w:rPr>
+              <w:t>FR-DPG-013</w:t>
+            </w:r>
+          </w:p>
+        </w:tc>
+        <w:tc>
+          <w:tcPr>
+            <w:tcW w:type="dxa" w:w="4680"/>
+          </w:tcPr>
+          <w:p>
+            <w:r/>
+            <w:r>
+              <w:rPr>
+                <w:b w:val="0"/>
+                <w:sz w:val="18"/>
+              </w:rPr>
+              <w:t>Display Update는 15 Signal bounded timer chunk로 모든 Physical/Raw를 사용자 요청 시에만 읽고 성공 후 baseline과 SnapshotValid=1을 게시하며 재진입은 Busy로 거부한다.</w:t>
+            </w:r>
+          </w:p>
+        </w:tc>
+      </w:tr>
+      <w:tr>
+        <w:tc>
+          <w:tcPr>
+            <w:tcW w:type="dxa" w:w="4680"/>
+          </w:tcPr>
+          <w:p>
+            <w:r/>
+            <w:r>
+              <w:rPr>
+                <w:b w:val="0"/>
+                <w:sz w:val="18"/>
+              </w:rPr>
+              <w:t>FR-DPG-014</w:t>
+            </w:r>
+          </w:p>
+        </w:tc>
+        <w:tc>
+          <w:tcPr>
+            <w:tcW w:type="dxa" w:w="4680"/>
+          </w:tcPr>
+          <w:p>
+            <w:r/>
+            <w:r>
+              <w:rPr>
+                <w:b w:val="0"/>
+                <w:sz w:val="18"/>
+              </w:rPr>
+              <w:t>Send Changed는 SnapshotValid=1에서 baseline과 다른 Signal만 CSV 순서로 Write하고 첫 실패에서 중단하며 성공 Signal을 read-back해 baseline·Physical·Raw·결과를 갱신한다.</w:t>
+            </w:r>
+          </w:p>
+        </w:tc>
+      </w:tr>
+      <w:tr>
+        <w:tc>
+          <w:tcPr>
+            <w:tcW w:type="dxa" w:w="4680"/>
+          </w:tcPr>
+          <w:p>
+            <w:r/>
+            <w:r>
+              <w:rPr>
+                <w:b w:val="0"/>
+                <w:sz w:val="18"/>
+              </w:rPr>
+              <w:t>FR-DPG-015</w:t>
+            </w:r>
+          </w:p>
+        </w:tc>
+        <w:tc>
+          <w:tcPr>
+            <w:tcW w:type="dxa" w:w="4680"/>
+          </w:tcPr>
+          <w:p>
+            <w:r/>
+            <w:r>
+              <w:rPr>
+                <w:b w:val="0"/>
+                <w:sz w:val="18"/>
+              </w:rPr>
+              <w:t>Device Reset은 M485E_Core_ResetDevice 성공 후 해당 Device Display Update를 수행한다.</w:t>
+            </w:r>
+          </w:p>
+        </w:tc>
+      </w:tr>
+      <w:tr>
+        <w:tc>
+          <w:tcPr>
+            <w:tcW w:type="dxa" w:w="4680"/>
+          </w:tcPr>
+          <w:p>
+            <w:r/>
+            <w:r>
+              <w:rPr>
+                <w:b w:val="0"/>
+                <w:sz w:val="18"/>
+              </w:rPr>
+              <w:t>FR-DPG-016</w:t>
+            </w:r>
+          </w:p>
+        </w:tc>
+        <w:tc>
+          <w:tcPr>
+            <w:tcW w:type="dxa" w:w="4680"/>
+          </w:tcPr>
+          <w:p>
+            <w:r/>
+            <w:r>
+              <w:rPr>
+                <w:b w:val="0"/>
+                <w:sz w:val="18"/>
+              </w:rPr>
+              <w:t>Reset All은 실제 Device Index 오름차순으로 Reset+read-back하며 첫 실패에서 중단하고 CompletedDeviceCount/FailedDeviceIndex/ResultCode를 게시한다.</w:t>
+            </w:r>
+          </w:p>
+        </w:tc>
+      </w:tr>
+      <w:tr>
+        <w:tc>
+          <w:tcPr>
+            <w:tcW w:type="dxa" w:w="4680"/>
+          </w:tcPr>
+          <w:p>
+            <w:r/>
+            <w:r>
+              <w:rPr>
+                <w:b w:val="0"/>
+                <w:sz w:val="18"/>
+              </w:rPr>
+              <w:t>FR-DPG-017</w:t>
+            </w:r>
+          </w:p>
+        </w:tc>
+        <w:tc>
+          <w:tcPr>
+            <w:tcW w:type="dxa" w:w="4680"/>
+          </w:tcPr>
+          <w:p>
+            <w:r/>
+            <w:r>
+              <w:rPr>
+                <w:b w:val="0"/>
+                <w:sz w:val="18"/>
+              </w:rPr>
+              <w:t>시작과 성공한 CSV Refresh 직후 모든 Device SnapshotValid를 0으로 무효화하며 실패한 Refresh는 기존 Active Runtime과 Snapshot을 보존한다.</w:t>
+            </w:r>
+          </w:p>
+        </w:tc>
+      </w:tr>
+      <w:tr>
+        <w:tc>
+          <w:tcPr>
+            <w:tcW w:type="dxa" w:w="4680"/>
+          </w:tcPr>
+          <w:p>
+            <w:r/>
+            <w:r>
+              <w:rPr>
+                <w:b w:val="0"/>
+                <w:sz w:val="18"/>
+              </w:rPr>
+              <w:t>FR-DPG-018</w:t>
+            </w:r>
+          </w:p>
+        </w:tc>
+        <w:tc>
+          <w:tcPr>
+            <w:tcW w:type="dxa" w:w="4680"/>
+          </w:tcPr>
+          <w:p>
+            <w:r/>
+            <w:r>
+              <w:rPr>
+                <w:b w:val="0"/>
+                <w:sz w:val="18"/>
+              </w:rPr>
+              <w:t>Display Update는 ReadSignal과 ReadRegisters 사이의 외부 Master 변경을 막지 않으므로 Device 전체 동일시점 원자 Snapshot으로 주장하지 않는다.</w:t>
+            </w:r>
+          </w:p>
+        </w:tc>
+      </w:tr>
+      <w:tr>
+        <w:tc>
+          <w:tcPr>
+            <w:tcW w:type="dxa" w:w="4680"/>
+          </w:tcPr>
+          <w:p>
+            <w:r/>
+            <w:r>
+              <w:rPr>
+                <w:b w:val="0"/>
+                <w:sz w:val="18"/>
+              </w:rPr>
+              <w:t>FR-DPG-019</w:t>
+            </w:r>
+          </w:p>
+        </w:tc>
+        <w:tc>
+          <w:tcPr>
+            <w:tcW w:type="dxa" w:w="4680"/>
+          </w:tcPr>
+          <w:p>
+            <w:r/>
+            <w:r>
+              <w:rPr>
+                <w:b w:val="0"/>
+                <w:sz w:val="18"/>
+              </w:rPr>
+              <w:t>Send Changed와 Reset All은 전체 Transaction 원자적이지 않으며 첫 실패 전 성공한 Write/Reset은 유지된다. 정수 Physical은 double 정책상 ±2^53까지만 정확하다.</w:t>
+            </w:r>
+          </w:p>
+        </w:tc>
+      </w:tr>
+      <w:tr>
+        <w:tc>
+          <w:tcPr>
+            <w:tcW w:type="dxa" w:w="4680"/>
+          </w:tcPr>
+          <w:p>
+            <w:r/>
+            <w:r>
+              <w:rPr>
+                <w:b w:val="0"/>
+                <w:sz w:val="18"/>
+              </w:rPr>
+              <w:t>FR-DPG-020</w:t>
+            </w:r>
+          </w:p>
+        </w:tc>
+        <w:tc>
+          <w:tcPr>
+            <w:tcW w:type="dxa" w:w="4680"/>
+          </w:tcPr>
+          <w:p>
+            <w:r/>
+            <w:r>
+              <w:rPr>
+                <w:b w:val="0"/>
+                <w:sz w:val="18"/>
+              </w:rPr>
+              <w:t>PyInstaller one-file Panel_Generator.exe, Sample generated Config, Manifest와 COPY_GUIDE를 배포하고 회사 Map은 저장소/패키지에 포함하지 않는다.</w:t>
             </w:r>
           </w:p>
         </w:tc>
@@ -31637,11 +32417,7 @@
         </w:tcPr>
         <w:p>
           <w:r>
-            <w:rPr>
-              <w:rFonts w:ascii="Malgun Gothic" w:hAnsi="Malgun Gothic" w:eastAsia="Malgun Gothic"/>
-              <w:sz w:val="17"/>
-            </w:rPr>
-            <w:t>Revision 0.16 | Release 0.4.0 Baseline</w:t>
+            <w:t>Revision 0.18 | Release 0.6.0</w:t>
           </w:r>
         </w:p>
       </w:tc>

</xml_diff>